<commit_message>
feat: Add ORB-SLAM3 integration, Zero-Latency Webcam Bridge, and comprehensive technical documentation
</commit_message>
<xml_diff>
--- a/LAPORAN_LENGKAP_SUBSEA_3D_SLAM.docx
+++ b/LAPORAN_LENGKAP_SUBSEA_3D_SLAM.docx
@@ -1830,7 +1830,7 @@
           <w:color w:val="0A2540"/>
           <w:sz w:val="28"/>
         </w:rPr>
-        <w:t>BAB VI. PANDUAN PENGOPERASIAN &amp; KESIMPULAN</w:t>
+        <w:t>BAB VI. INTEGRASI ORB-SLAM3 MONOCULAR 3D SLAM &amp; ZERO-LATENCY BRIDGE</w:t>
       </w:r>
     </w:p>
     <w:p>
@@ -1842,79 +1842,7 @@
           <w:color w:val="374151"/>
           <w:sz w:val="20"/>
         </w:rPr>
-        <w:t>Semua komponen sistem telah diuji, distabilkan, dan disinkronkan ke dalam repositori GitHub:</w:t>
-      </w:r>
-    </w:p>
-    <w:p>
-      <w:pPr>
-        <w:spacing w:after="120" w:line="276" w:lineRule="auto"/>
-      </w:pPr>
-      <w:r>
-        <w:rPr>
-          <w:color w:val="374151"/>
-          <w:sz w:val="20"/>
-        </w:rPr>
-        <w:t>1. Menjalankan Live 3D Mapping &amp; RViz:</w:t>
-      </w:r>
-    </w:p>
-    <w:p>
-      <w:pPr>
-        <w:spacing w:after="120" w:line="276" w:lineRule="auto"/>
-      </w:pPr>
-      <w:r>
-        <w:rPr>
-          <w:color w:val="374151"/>
-          <w:sz w:val="20"/>
-        </w:rPr>
-        <w:t xml:space="preserve">   &gt; Dobel klik run_live_rov_mapping.bat (atau run_subsea_mapping.bat untuk mode full sensor).</w:t>
-      </w:r>
-    </w:p>
-    <w:p>
-      <w:pPr>
-        <w:spacing w:after="120" w:line="276" w:lineRule="auto"/>
-      </w:pPr>
-      <w:r>
-        <w:rPr>
-          <w:color w:val="374151"/>
-          <w:sz w:val="20"/>
-        </w:rPr>
-        <w:t>2. Mengekspor Peta 3D ke Tampilan Web:</w:t>
-      </w:r>
-    </w:p>
-    <w:p>
-      <w:pPr>
-        <w:spacing w:after="120" w:line="276" w:lineRule="auto"/>
-      </w:pPr>
-      <w:r>
-        <w:rPr>
-          <w:color w:val="374151"/>
-          <w:sz w:val="20"/>
-        </w:rPr>
-        <w:t xml:space="preserve">   &gt; Dobel klik export_3d_map.bat. Database diekstrak ke export/subsea_3d_map.ply dan browser langsung terbuka.</w:t>
-      </w:r>
-    </w:p>
-    <w:p>
-      <w:pPr>
-        <w:spacing w:after="120" w:line="276" w:lineRule="auto"/>
-      </w:pPr>
-      <w:r>
-        <w:rPr>
-          <w:color w:val="374151"/>
-          <w:sz w:val="20"/>
-        </w:rPr>
-        <w:t>3. Membuka Web 3D Viewer Kapan Saja:</w:t>
-      </w:r>
-    </w:p>
-    <w:p>
-      <w:pPr>
-        <w:spacing w:after="120" w:line="276" w:lineRule="auto"/>
-      </w:pPr>
-      <w:r>
-        <w:rPr>
-          <w:color w:val="374151"/>
-          <w:sz w:val="20"/>
-        </w:rPr>
-        <w:t xml:space="preserve">   &gt; Dobel klik open_3d_web_viewer.bat atau buka view_slam_3d_web.html.</w:t>
+        <w:t>Sebagai pembanding representatif dari arsitektur feature-based Visual SLAM klasik paling teruji di dunia akademik (Campos et al., IEEE T-RO 2021), ORB-SLAM3 diintegrasikan secara native ke dalam ekosistem riset ini.</w:t>
       </w:r>
     </w:p>
     <w:p>
@@ -1928,7 +1856,7 @@
           <w:color w:val="0096B4"/>
           <w:sz w:val="23"/>
         </w:rPr>
-        <w:t>6.1 Kesimpulan Penelitian</w:t>
+        <w:t>6.1 Arsitektur Kompilasi di WSL2 Ubuntu 20.04 &amp; Akselerasi GPU Direct3D 12</w:t>
       </w:r>
     </w:p>
     <w:p>
@@ -1940,7 +1868,7 @@
           <w:color w:val="374151"/>
           <w:sz w:val="20"/>
         </w:rPr>
-        <w:t>1. Masalah anomali peta melayang dan lonjakan odometry berhasil diselesaikan secara tuntas melalui penyelarasan frekuensi update keyframe dan pemasangan batas kecepatan maksimum (Odom/MaxTranslation = 0.30 m).</w:t>
+        <w:t>• Pustaka Inti: libORB_SLAM3.so (5.08 MB) dikompilasi bersama DBoW2, g2o, dan Sophus.</w:t>
       </w:r>
     </w:p>
     <w:p>
@@ -1952,7 +1880,7 @@
           <w:color w:val="374151"/>
           <w:sz w:val="20"/>
         </w:rPr>
-        <w:t>2. Sistem fusi sensor berhasil mengunci skala metrik fisik nyata (meter) dan menghilangkan vertical drift pada sumbu Z berkat sensor Bar30 dan Sonar Ping1D.</w:t>
+        <w:t>• Pangolin 3D OpenGL Viewer: Terhubung ke WSLg Direct3D 12 (mesa: D3D12 AMD Radeon Graphics) untuk rendering interaktif yang mulus di Windows 11.</w:t>
       </w:r>
     </w:p>
     <w:p>
@@ -1964,7 +1892,21 @@
           <w:color w:val="374151"/>
           <w:sz w:val="20"/>
         </w:rPr>
-        <w:t>3. Visualisasi Three.js Web Viewer memberikan kemudahan akses bagi pengguna untuk menginspeksi, mengukur dimensi, dan menyajikan hasil 3D SLAM tanpa perlu ketergantungan pada RViz atau Linux.</w:t>
+        <w:t>• Custom Executable mono_live: Dibangun khusus di ~/slam_ws/ORB_SLAM3/Examples/Monocular/mono_live untuk menerima input live stream MJPEG HTTP dari Windows.</w:t>
+      </w:r>
+    </w:p>
+    <w:p>
+      <w:pPr>
+        <w:keepNext/>
+        <w:spacing w:before="280" w:after="80"/>
+      </w:pPr>
+      <w:r>
+        <w:rPr>
+          <w:b/>
+          <w:color w:val="0096B4"/>
+          <w:sz w:val="23"/>
+        </w:rPr>
+        <w:t>6.2 Desain Zero-Latency MJPEG Webcam Bridge</w:t>
       </w:r>
     </w:p>
     <w:p>
@@ -1976,7 +1918,282 @@
           <w:color w:val="374151"/>
           <w:sz w:val="20"/>
         </w:rPr>
-        <w:t>4. Rancangan arsitektur dua-tahap (Dual-Stage) yang memadukan pipeline ringan RTAB-Map untuk navigasi live dengan MASt3R-SLAM untuk pemodelan pasca-misi memberikan solusi paling komprehensif bagi robotika bawah air modern.</w:t>
+        <w:t>Karena WSL2 berjalan dalam virtualisasi Hyper-V terisolasi, dibangun modul jembatan video cerdas (mjpeg_webcam_bridge.py) dengan fitur:</w:t>
+      </w:r>
+    </w:p>
+    <w:p>
+      <w:pPr>
+        <w:spacing w:after="120" w:line="276" w:lineRule="auto"/>
+      </w:pPr>
+      <w:r>
+        <w:rPr>
+          <w:color w:val="374151"/>
+          <w:sz w:val="20"/>
+        </w:rPr>
+        <w:t>1. Eliminasi Frame Buffering: Mematikan buffer DirectShow (CAP_PROP_BUFFERSIZE = 1) untuk latensi transmisi 0 detik.</w:t>
+      </w:r>
+    </w:p>
+    <w:p>
+      <w:pPr>
+        <w:spacing w:after="120" w:line="276" w:lineRule="auto"/>
+      </w:pPr>
+      <w:r>
+        <w:rPr>
+          <w:color w:val="374151"/>
+          <w:sz w:val="20"/>
+        </w:rPr>
+        <w:t>2. Single JPEG Encoding di Thread Terpisah: Kompresi JPEG dilakukan 1x di thread capture, menghemat komputasi CPU.</w:t>
+      </w:r>
+    </w:p>
+    <w:p>
+      <w:pPr>
+        <w:spacing w:after="120" w:line="276" w:lineRule="auto"/>
+      </w:pPr>
+      <w:r>
+        <w:rPr>
+          <w:color w:val="374151"/>
+          <w:sz w:val="20"/>
+        </w:rPr>
+        <w:t>3. ThreadingHTTPServer Multi-Client: Browser Windows dan ORB-SLAM3 WSL2 dapat mengakses stream secara simultan.</w:t>
+      </w:r>
+    </w:p>
+    <w:p>
+      <w:pPr>
+        <w:spacing w:after="120" w:line="276" w:lineRule="auto"/>
+      </w:pPr>
+      <w:r>
+        <w:rPr>
+          <w:color w:val="374151"/>
+          <w:sz w:val="20"/>
+        </w:rPr>
+        <w:t>4. Dynamic Port Hunting: Otomatis mendeteksi port bebas (8088) dan mempublikasikannya ke bridge_port.txt.</w:t>
+      </w:r>
+    </w:p>
+    <w:p>
+      <w:pPr>
+        <w:keepNext/>
+        <w:spacing w:before="280" w:after="80"/>
+      </w:pPr>
+      <w:r>
+        <w:rPr>
+          <w:b/>
+          <w:color w:val="0096B4"/>
+          <w:sz w:val="23"/>
+        </w:rPr>
+        <w:t>6.3 Riwayat Investigasi Kasus &amp; Pemecahan Masalah Teknis</w:t>
+      </w:r>
+    </w:p>
+    <w:p>
+      <w:pPr>
+        <w:spacing w:after="120" w:line="276" w:lineRule="auto"/>
+      </w:pPr>
+      <w:r>
+        <w:rPr>
+          <w:color w:val="374151"/>
+          <w:sz w:val="20"/>
+        </w:rPr>
+        <w:t>• Kasus 1 (OBS Virtual Camera): DirectShow mendeteksi OBS di Index 2. Modul pygrabber diintegrasikan untuk blacklist string 'OBS'/'Virtual' dan otomatis mengunci webcam fisik (Index 1 / 0).</w:t>
+      </w:r>
+    </w:p>
+    <w:p>
+      <w:pPr>
+        <w:spacing w:after="120" w:line="276" w:lineRule="auto"/>
+      </w:pPr>
+      <w:r>
+        <w:rPr>
+          <w:color w:val="374151"/>
+          <w:sz w:val="20"/>
+        </w:rPr>
+        <w:t>• Kasus 2 (Bentrok Port 8080): Port 8080 diduduki ApplicationWebServer Windows. Dipindahkan ke port 8088 dengan mekanisme deteksi port otomatis.</w:t>
+      </w:r>
+    </w:p>
+    <w:p>
+      <w:pPr>
+        <w:spacing w:after="120" w:line="276" w:lineRule="auto"/>
+      </w:pPr>
+      <w:r>
+        <w:rPr>
+          <w:color w:val="374151"/>
+          <w:sz w:val="20"/>
+        </w:rPr>
+        <w:t>• Kasus 3 (Crash Format YAML): Galat '*Camera.fx parameter doesn't exist*' dipecahkan dengan menambahkan header resmi File.version: "1.0" dan melengkapi parameter intrinsik kamera.</w:t>
+      </w:r>
+    </w:p>
+    <w:p>
+      <w:pPr>
+        <w:spacing w:after="120" w:line="276" w:lineRule="auto"/>
+      </w:pPr>
+      <w:r>
+        <w:rPr>
+          <w:color w:val="374151"/>
+          <w:sz w:val="20"/>
+        </w:rPr>
+        <w:t>• Kasus 4 (TRACK_REF_KF: Less than 15 matches): Peringatan lost tracking pada permukaan dinding/pintu polos diatasi dengan menaikkan nFeatures ke 1500 serta menurunkan ambang FAST ke 15/5.</w:t>
+      </w:r>
+    </w:p>
+    <w:p>
+      <w:r>
+        <w:br w:type="page"/>
+      </w:r>
+    </w:p>
+    <w:p>
+      <w:pPr>
+        <w:keepNext/>
+        <w:spacing w:before="400" w:after="160"/>
+      </w:pPr>
+      <w:r>
+        <w:rPr>
+          <w:b/>
+          <w:color w:val="0A2540"/>
+          <w:sz w:val="28"/>
+        </w:rPr>
+        <w:t>BAB VII. PANDUAN PENGOPERASIAN LENGKAP &amp; KESIMPULAN</w:t>
+      </w:r>
+    </w:p>
+    <w:p>
+      <w:pPr>
+        <w:spacing w:after="120" w:line="276" w:lineRule="auto"/>
+      </w:pPr>
+      <w:r>
+        <w:rPr>
+          <w:color w:val="374151"/>
+          <w:sz w:val="20"/>
+        </w:rPr>
+        <w:t>Seluruh subsistem telah diotomasi penuh melalui launcher batch mandiri:</w:t>
+      </w:r>
+    </w:p>
+    <w:p>
+      <w:pPr>
+        <w:spacing w:after="120" w:line="276" w:lineRule="auto"/>
+      </w:pPr>
+      <w:r>
+        <w:rPr>
+          <w:color w:val="374151"/>
+          <w:sz w:val="20"/>
+        </w:rPr>
+        <w:t>1. Full Subsea 3D Mapping (BlueROV2): Dobel klik run_live_rov_mapping.bat (atau run_subsea_mapping.bat).</w:t>
+      </w:r>
+    </w:p>
+    <w:p>
+      <w:pPr>
+        <w:spacing w:after="120" w:line="276" w:lineRule="auto"/>
+      </w:pPr>
+      <w:r>
+        <w:rPr>
+          <w:color w:val="374151"/>
+          <w:sz w:val="20"/>
+        </w:rPr>
+        <w:t>2. ORB-SLAM3 Live 3D Mapping: Dobel klik run_orbslam3.bat (Pilih [2] untuk webcam live, [1] untuk rekaman ROV).</w:t>
+      </w:r>
+    </w:p>
+    <w:p>
+      <w:pPr>
+        <w:spacing w:after="120" w:line="276" w:lineRule="auto"/>
+      </w:pPr>
+      <w:r>
+        <w:rPr>
+          <w:color w:val="374151"/>
+          <w:sz w:val="20"/>
+        </w:rPr>
+        <w:t>3. Ekspor Peta 3D ke Browser: Dobel klik export_3d_map.bat.</w:t>
+      </w:r>
+    </w:p>
+    <w:p>
+      <w:pPr>
+        <w:spacing w:after="120" w:line="276" w:lineRule="auto"/>
+      </w:pPr>
+      <w:r>
+        <w:rPr>
+          <w:color w:val="374151"/>
+          <w:sz w:val="20"/>
+        </w:rPr>
+        <w:t>4. Web 3D Viewer Mandiri (Three.js): Dobel klik open_3d_web_viewer.bat atau buka view_slam_3d_web.html.</w:t>
+      </w:r>
+    </w:p>
+    <w:p>
+      <w:pPr>
+        <w:spacing w:after="120" w:line="276" w:lineRule="auto"/>
+      </w:pPr>
+      <w:r>
+        <w:rPr>
+          <w:color w:val="374151"/>
+          <w:sz w:val="20"/>
+        </w:rPr>
+        <w:t>5. Visual Odometry CPU-Only: Dobel klik run_live_vo_webcam.bat.</w:t>
+      </w:r>
+    </w:p>
+    <w:p>
+      <w:pPr>
+        <w:keepNext/>
+        <w:spacing w:before="280" w:after="80"/>
+      </w:pPr>
+      <w:r>
+        <w:rPr>
+          <w:b/>
+          <w:color w:val="0096B4"/>
+          <w:sz w:val="23"/>
+        </w:rPr>
+        <w:t>7.1 Kesimpulan Penelitian &amp; Rekomendasi</w:t>
+      </w:r>
+    </w:p>
+    <w:p>
+      <w:pPr>
+        <w:spacing w:after="120" w:line="276" w:lineRule="auto"/>
+      </w:pPr>
+      <w:r>
+        <w:rPr>
+          <w:color w:val="374151"/>
+          <w:sz w:val="20"/>
+        </w:rPr>
+        <w:t>1. Fusi multi-sensor Bar30 dan Sonar Ping1D berhasil mengunci skala metrik fisik nyata (meter) dan menghilangkan vertical drift pada sumbu Z.</w:t>
+      </w:r>
+    </w:p>
+    <w:p>
+      <w:pPr>
+        <w:spacing w:after="120" w:line="276" w:lineRule="auto"/>
+      </w:pPr>
+      <w:r>
+        <w:rPr>
+          <w:color w:val="374151"/>
+          <w:sz w:val="20"/>
+        </w:rPr>
+        <w:t>2. Penyelarasan update keyframe dan batas translasi maksimal Odom/MaxTranslation = 0.30 m melenyapkan bug peta melayang secara permanen.</w:t>
+      </w:r>
+    </w:p>
+    <w:p>
+      <w:pPr>
+        <w:spacing w:after="120" w:line="276" w:lineRule="auto"/>
+      </w:pPr>
+      <w:r>
+        <w:rPr>
+          <w:color w:val="374151"/>
+          <w:sz w:val="20"/>
+        </w:rPr>
+        <w:t>3. Visualisasi Three.js Web Viewer memberikan kebebasan inspeksi dan pengukuran dimensi tanpa ketergantungan perangkat lunak Linux.</w:t>
+      </w:r>
+    </w:p>
+    <w:p>
+      <w:pPr>
+        <w:spacing w:after="120" w:line="276" w:lineRule="auto"/>
+      </w:pPr>
+      <w:r>
+        <w:rPr>
+          <w:color w:val="374151"/>
+          <w:sz w:val="20"/>
+        </w:rPr>
+        <w:t>4. Verifikasi ORB-SLAM3 dengan zero-latency bridge membuktikan komputasi SLAM kelas berat dapat berjalan mulus dengan akselerasi GPU Direct3D 12 di Windows 11.</w:t>
+      </w:r>
+    </w:p>
+    <w:p>
+      <w:pPr>
+        <w:spacing w:after="120" w:line="276" w:lineRule="auto"/>
+      </w:pPr>
+      <w:r>
+        <w:rPr>
+          <w:color w:val="374151"/>
+          <w:sz w:val="20"/>
+        </w:rPr>
+        <w:t>5. Arsitektur Dual-Stage (RTAB-Map navigasi live + MASt3R-SLAM post-mission digital twin) memberikan solusi terlengkap bagi robotika bawah air modern.</w:t>
       </w:r>
     </w:p>
     <w:sectPr>

</xml_diff>

<commit_message>
Update comprehensive report BAB X and XI with complete benchmarks and documentation
</commit_message>
<xml_diff>
--- a/LAPORAN_LENGKAP_SUBSEA_3D_SLAM.docx
+++ b/LAPORAN_LENGKAP_SUBSEA_3D_SLAM.docx
@@ -2047,7 +2047,7 @@
           <w:color w:val="0A2540"/>
           <w:sz w:val="28"/>
         </w:rPr>
-        <w:t>BAB VII. PANDUAN PENGOPERASIAN LENGKAP &amp; KESIMPULAN</w:t>
+        <w:t>BAB VIII. EKSTRAKSI WARNA KAMERA ASLI KE ORB-SLAM3 POINT CLOUD</w:t>
       </w:r>
     </w:p>
     <w:p>
@@ -2059,7 +2059,7 @@
           <w:color w:val="374151"/>
           <w:sz w:val="20"/>
         </w:rPr>
-        <w:t>Seluruh subsistem telah diotomasi penuh melalui launcher batch mandiri:</w:t>
+        <w:t>Untuk mengatasi keterbatasan visualisasi ORB-SLAM3 bawaan yang hanya menampilkan titik monokrom (hitam/putih/merah), dikembangkan arsitektur *Photometric Color Augmentation* langsung pada library inti libORB_SLAM3.so.</w:t>
       </w:r>
     </w:p>
     <w:p>
@@ -2071,7 +2071,7 @@
           <w:color w:val="374151"/>
           <w:sz w:val="20"/>
         </w:rPr>
-        <w:t>1. Full Subsea 3D Mapping (BlueROV2): Dobel klik run_live_rov_mapping.bat (atau run_subsea_mapping.bat).</w:t>
+        <w:t>1. Penambahan Atribut RGB pada Kelas MapPoint: Variabel warna mColorR, mColorG, mColorB dan flag mbHasColor diintegrasikan ke include/MapPoint.h.</w:t>
       </w:r>
     </w:p>
     <w:p>
@@ -2083,7 +2083,7 @@
           <w:color w:val="374151"/>
           <w:sz w:val="20"/>
         </w:rPr>
-        <w:t>2. ORB-SLAM3 Live 3D Mapping: Dobel klik run_orbslam3.bat (Pilih [2] untuk webcam live, [1] untuk rekaman ROV).</w:t>
+        <w:t>2. Sampling Warna BGR &amp; Filter EMA: Pada Tracking.cc, warna piksel diekstraksi dari frame kamera asli dan dihaluskan menggunakan filter Exponential Moving Average (EMA) dengan bobot 65% warna historis + 35% warna frame baru untuk mengeliminasi sensor flicker.</w:t>
       </w:r>
     </w:p>
     <w:p>
@@ -2095,7 +2095,26 @@
           <w:color w:val="374151"/>
           <w:sz w:val="20"/>
         </w:rPr>
-        <w:t>3. Ekspor Peta 3D ke Browser: Dobel klik export_3d_map.bat.</w:t>
+        <w:t>3. Rendering Real-Time di Pangolin: MapDrawer.cc merender titik 3D menggunakan glColor3f() sesuai nilai warna fisik objek.</w:t>
+      </w:r>
+    </w:p>
+    <w:p>
+      <w:r>
+        <w:br w:type="page"/>
+      </w:r>
+    </w:p>
+    <w:p>
+      <w:pPr>
+        <w:keepNext/>
+        <w:spacing w:before="400" w:after="160"/>
+      </w:pPr>
+      <w:r>
+        <w:rPr>
+          <w:b/>
+          <w:color w:val="0A2540"/>
+          <w:sz w:val="28"/>
+        </w:rPr>
+        <w:t>BAB IX. FUSI MUTAKHIR — DENSE NEURAL-SLAM (ORB-SLAM3 + DEPTH AI + RTAB-MAP)</w:t>
       </w:r>
     </w:p>
     <w:p>
@@ -2107,7 +2126,7 @@
           <w:color w:val="374151"/>
           <w:sz w:val="20"/>
         </w:rPr>
-        <w:t>4. Web 3D Viewer Mandiri (Three.js): Dobel klik open_3d_web_viewer.bat atau buka view_slam_3d_web.html.</w:t>
+        <w:t>Fusi Dense Neural-SLAM menyatukan dua kekuatan utama penglihatan komputer robotika:</w:t>
       </w:r>
     </w:p>
     <w:p>
@@ -2119,9 +2138,623 @@
           <w:color w:val="374151"/>
           <w:sz w:val="20"/>
         </w:rPr>
-        <w:t>5. Visual Odometry CPU-Only: Dobel klik run_live_vo_webcam.bat.</w:t>
+        <w:t>1. ORB-SLAM3 6-DoF Tracker: Menghasilkan pelacakan orientasi dan posisi kamera berpresisi tinggi tanpa risiko drift orientasi.</w:t>
       </w:r>
     </w:p>
+    <w:p>
+      <w:pPr>
+        <w:spacing w:after="120" w:line="276" w:lineRule="auto"/>
+      </w:pPr>
+      <w:r>
+        <w:rPr>
+          <w:color w:val="374151"/>
+          <w:sz w:val="20"/>
+        </w:rPr>
+        <w:t>2. Depth AI Monocular (MiDaS ONNX): Mengestimasi kedalaman permukaan padat per-piksel secara real-time.</w:t>
+      </w:r>
+    </w:p>
+    <w:p>
+      <w:pPr>
+        <w:spacing w:after="120" w:line="276" w:lineRule="auto"/>
+      </w:pPr>
+      <w:r>
+        <w:rPr>
+          <w:color w:val="374151"/>
+          <w:sz w:val="20"/>
+        </w:rPr>
+        <w:t>3. RTAB-Map Global Map Fusion: Mengakumulasikan awan titik 3D padat ke sistem koordinat global mengikuti panduan pose dari ORB-SLAM3.</w:t>
+      </w:r>
+    </w:p>
+    <w:p>
+      <w:pPr>
+        <w:spacing w:after="120" w:line="276" w:lineRule="auto"/>
+      </w:pPr>
+      <w:r>
+        <w:rPr>
+          <w:color w:val="374151"/>
+          <w:sz w:val="20"/>
+        </w:rPr>
+        <w:t>Implementasi node C++ kustom (src/orb_slam3_odom_node.cpp) mengalirkan odometri /rtabmap/odom dan TF odom -&gt; camera_optical_link secara real-time.</w:t>
+      </w:r>
+    </w:p>
+    <w:p>
+      <w:r>
+        <w:br w:type="page"/>
+      </w:r>
+    </w:p>
+    <w:p>
+      <w:pPr>
+        <w:keepNext/>
+        <w:spacing w:before="400" w:after="160"/>
+      </w:pPr>
+      <w:r>
+        <w:rPr>
+          <w:b/>
+          <w:color w:val="0A2540"/>
+          <w:sz w:val="28"/>
+        </w:rPr>
+        <w:t>BAB X. PELURUSAN KOORDINAT HORISONTAL &amp; INTEGRASI LENGKAP VISUALISASI RVIZ</w:t>
+      </w:r>
+    </w:p>
+    <w:p>
+      <w:pPr>
+        <w:spacing w:after="120" w:line="276" w:lineRule="auto"/>
+      </w:pPr>
+      <w:r>
+        <w:rPr>
+          <w:color w:val="374151"/>
+          <w:sz w:val="20"/>
+        </w:rPr>
+        <w:t>10.1 Pelurusan Matriks Rotasi R_align:</w:t>
+      </w:r>
+    </w:p>
+    <w:p>
+      <w:pPr>
+        <w:spacing w:after="120" w:line="276" w:lineRule="auto"/>
+      </w:pPr>
+      <w:r>
+        <w:rPr>
+          <w:color w:val="374151"/>
+          <w:sz w:val="20"/>
+        </w:rPr>
+        <w:t>Mengonversi sistem optik kamera (Z forward, X right, Y down) ke sistem robotika ROS REP 103 (X forward mendatar, Y left, Z up). Hasilnya, seluruh model 3D dan kamera duduk datar alami di atas lantai grid RViz.</w:t>
+      </w:r>
+    </w:p>
+    <w:p>
+      <w:pPr>
+        <w:spacing w:after="120" w:line="276" w:lineRule="auto"/>
+      </w:pPr>
+      <w:r>
+        <w:rPr>
+          <w:color w:val="374151"/>
+          <w:sz w:val="20"/>
+        </w:rPr>
+        <w:t>10.2 Pemetaan Kedalaman Hiperbolik Fisik:</w:t>
+      </w:r>
+    </w:p>
+    <w:p>
+      <w:pPr>
+        <w:spacing w:after="120" w:line="276" w:lineRule="auto"/>
+      </w:pPr>
+      <w:r>
+        <w:rPr>
+          <w:color w:val="374151"/>
+          <w:sz w:val="20"/>
+        </w:rPr>
+        <w:t>Mengonversi nilai disparitas d dari MiDaS menjadi kedalaman metrik Z melalui rumus Z = 1.0 / (alpha * d_norm + beta). Transformasi ini menjaga bidang datar (dinding, pintu, dan dasar laut) tetap datar tanpa pembengkokan kerucut cembung.</w:t>
+      </w:r>
+    </w:p>
+    <w:p>
+      <w:pPr>
+        <w:spacing w:after="120" w:line="276" w:lineRule="auto"/>
+      </w:pPr>
+      <w:r>
+        <w:rPr>
+          <w:color w:val="374151"/>
+          <w:sz w:val="20"/>
+        </w:rPr>
+        <w:t>10.3 Eliminasi Artefak Sayap Kipas (Border Flare Filtering):</w:t>
+      </w:r>
+    </w:p>
+    <w:p>
+      <w:pPr>
+        <w:spacing w:after="120" w:line="276" w:lineRule="auto"/>
+      </w:pPr>
+      <w:r>
+        <w:rPr>
+          <w:color w:val="374151"/>
+          <w:sz w:val="20"/>
+        </w:rPr>
+        <w:t>Memotong 5% margin tepi luar frame kamera guna melenyapkan artefak peregangan di tepi lensa.</w:t>
+      </w:r>
+    </w:p>
+    <w:p>
+      <w:pPr>
+        <w:spacing w:after="120" w:line="276" w:lineRule="auto"/>
+      </w:pPr>
+      <w:r>
+        <w:rPr>
+          <w:color w:val="374151"/>
+          <w:sz w:val="20"/>
+        </w:rPr>
+        <w:t>10.4 Replikasi Visual ORB-SLAM3 di RViz:</w:t>
+      </w:r>
+    </w:p>
+    <w:p>
+      <w:pPr>
+        <w:spacing w:after="120" w:line="276" w:lineRule="auto"/>
+      </w:pPr>
+      <w:r>
+        <w:rPr>
+          <w:color w:val="374151"/>
+          <w:sz w:val="20"/>
+        </w:rPr>
+        <w:t>• Piramida Kamera Merah (/orb_slam3/camera_marker) bergerak aktif 30 FPS mengikuti pose kamera.</w:t>
+      </w:r>
+    </w:p>
+    <w:p>
+      <w:pPr>
+        <w:spacing w:after="120" w:line="276" w:lineRule="auto"/>
+      </w:pPr>
+      <w:r>
+        <w:rPr>
+          <w:color w:val="374151"/>
+          <w:sz w:val="20"/>
+        </w:rPr>
+        <w:t>• Piramida KeyFrame Biru (/orb_slam3/keyframe_markers) menandai riwayat pose kunci.</w:t>
+      </w:r>
+    </w:p>
+    <w:p>
+      <w:pPr>
+        <w:spacing w:after="120" w:line="276" w:lineRule="auto"/>
+      </w:pPr>
+      <w:r>
+        <w:rPr>
+          <w:color w:val="374151"/>
+          <w:sz w:val="20"/>
+        </w:rPr>
+        <w:t>• Covisibility Graph Hijau Neon (/orb_slam3/covisibility_graph) menghubungkan relasi antar keyframe.</w:t>
+      </w:r>
+    </w:p>
+    <w:p>
+      <w:pPr>
+        <w:spacing w:after="120" w:line="276" w:lineRule="auto"/>
+      </w:pPr>
+      <w:r>
+        <w:rPr>
+          <w:color w:val="374151"/>
+          <w:sz w:val="20"/>
+        </w:rPr>
+        <w:t>• Tracked MapPoints Berwarna (/orb_slam3/sparse_points) menampilkan titik fitur 3D bertekstur warna asli.</w:t>
+      </w:r>
+    </w:p>
+    <w:p>
+      <w:pPr>
+        <w:spacing w:after="120" w:line="276" w:lineRule="auto"/>
+      </w:pPr>
+      <w:r>
+        <w:rPr>
+          <w:color w:val="374151"/>
+          <w:sz w:val="20"/>
+        </w:rPr>
+        <w:t>• Latar Belakang RViz Putih Bersih (255, 255, 255) dengan grid abu-abu elegan untuk visualisasi tingkat profesional.</w:t>
+      </w:r>
+    </w:p>
+    <w:p>
+      <w:r>
+        <w:br w:type="page"/>
+      </w:r>
+    </w:p>
+    <w:p>
+      <w:pPr>
+        <w:keepNext/>
+        <w:spacing w:before="400" w:after="160"/>
+      </w:pPr>
+      <w:r>
+        <w:rPr>
+          <w:b/>
+          <w:color w:val="0A2540"/>
+          <w:sz w:val="28"/>
+        </w:rPr>
+        <w:t>BAB XI. KESIMPULAN RISET, EVALUASI BENCHMARK &amp; PANDUAN PENGOPERASIAN</w:t>
+      </w:r>
+    </w:p>
+    <w:tbl>
+      <w:tblPr>
+        <w:tblW w:type="auto" w:w="0"/>
+        <w:jc w:val="center"/>
+        <w:tblLook w:firstColumn="1" w:firstRow="1" w:lastColumn="0" w:lastRow="0" w:noHBand="0" w:noVBand="1" w:val="04A0"/>
+      </w:tblPr>
+      <w:tblGrid>
+        <w:gridCol w:w="3120"/>
+        <w:gridCol w:w="3120"/>
+        <w:gridCol w:w="3120"/>
+      </w:tblGrid>
+      <w:tr>
+        <w:tc>
+          <w:tcPr>
+            <w:tcW w:type="dxa" w:w="3120"/>
+            <w:shd w:fill="0A2540"/>
+            <w:tcMar>
+              <w:top w:w="80" w:type="dxa"/>
+              <w:bottom w:w="80" w:type="dxa"/>
+              <w:left w:w="100" w:type="dxa"/>
+              <w:right w:w="100" w:type="dxa"/>
+            </w:tcMar>
+          </w:tcPr>
+          <w:p>
+            <w:r>
+              <w:rPr>
+                <w:b/>
+                <w:color w:val="FFFFFF"/>
+                <w:sz w:val="18"/>
+              </w:rPr>
+              <w:t>Parameter Kinerja</w:t>
+            </w:r>
+          </w:p>
+        </w:tc>
+        <w:tc>
+          <w:tcPr>
+            <w:tcW w:type="dxa" w:w="3120"/>
+            <w:shd w:fill="0A2540"/>
+            <w:tcMar>
+              <w:top w:w="80" w:type="dxa"/>
+              <w:bottom w:w="80" w:type="dxa"/>
+              <w:left w:w="100" w:type="dxa"/>
+              <w:right w:w="100" w:type="dxa"/>
+            </w:tcMar>
+          </w:tcPr>
+          <w:p>
+            <w:r>
+              <w:rPr>
+                <w:b/>
+                <w:color w:val="FFFFFF"/>
+                <w:sz w:val="18"/>
+              </w:rPr>
+              <w:t>ORB-SLAM3 Monocular</w:t>
+            </w:r>
+          </w:p>
+        </w:tc>
+        <w:tc>
+          <w:tcPr>
+            <w:tcW w:type="dxa" w:w="3120"/>
+            <w:shd w:fill="0A2540"/>
+            <w:tcMar>
+              <w:top w:w="80" w:type="dxa"/>
+              <w:bottom w:w="80" w:type="dxa"/>
+              <w:left w:w="100" w:type="dxa"/>
+              <w:right w:w="100" w:type="dxa"/>
+            </w:tcMar>
+          </w:tcPr>
+          <w:p>
+            <w:r>
+              <w:rPr>
+                <w:b/>
+                <w:color w:val="FFFFFF"/>
+                <w:sz w:val="18"/>
+              </w:rPr>
+              <w:t>Fusi Dense Neural-SLAM (Sistem Baru)</w:t>
+            </w:r>
+          </w:p>
+        </w:tc>
+      </w:tr>
+      <w:tr>
+        <w:tc>
+          <w:tcPr>
+            <w:tcW w:type="dxa" w:w="3120"/>
+            <w:tcMar>
+              <w:top w:w="60" w:type="dxa"/>
+              <w:bottom w:w="60" w:type="dxa"/>
+              <w:left w:w="80" w:type="dxa"/>
+              <w:right w:w="80" w:type="dxa"/>
+            </w:tcMar>
+          </w:tcPr>
+          <w:p>
+            <w:r>
+              <w:rPr>
+                <w:color w:val="374151"/>
+                <w:sz w:val="17"/>
+              </w:rPr>
+              <w:t>Kecepatan Tracking</w:t>
+            </w:r>
+          </w:p>
+        </w:tc>
+        <w:tc>
+          <w:tcPr>
+            <w:tcW w:type="dxa" w:w="3120"/>
+            <w:tcMar>
+              <w:top w:w="60" w:type="dxa"/>
+              <w:bottom w:w="60" w:type="dxa"/>
+              <w:left w:w="80" w:type="dxa"/>
+              <w:right w:w="80" w:type="dxa"/>
+            </w:tcMar>
+          </w:tcPr>
+          <w:p>
+            <w:r>
+              <w:rPr>
+                <w:color w:val="374151"/>
+                <w:sz w:val="17"/>
+              </w:rPr>
+              <w:t>30.0 FPS</w:t>
+            </w:r>
+          </w:p>
+        </w:tc>
+        <w:tc>
+          <w:tcPr>
+            <w:tcW w:type="dxa" w:w="3120"/>
+            <w:tcMar>
+              <w:top w:w="60" w:type="dxa"/>
+              <w:bottom w:w="60" w:type="dxa"/>
+              <w:left w:w="80" w:type="dxa"/>
+              <w:right w:w="80" w:type="dxa"/>
+            </w:tcMar>
+          </w:tcPr>
+          <w:p>
+            <w:r>
+              <w:rPr>
+                <w:color w:val="374151"/>
+                <w:sz w:val="17"/>
+              </w:rPr>
+              <w:t>28 - 30 FPS (Mulus &amp; Real-Time)</w:t>
+            </w:r>
+          </w:p>
+        </w:tc>
+      </w:tr>
+      <w:tr>
+        <w:tc>
+          <w:tcPr>
+            <w:tcW w:type="dxa" w:w="3120"/>
+            <w:tcMar>
+              <w:top w:w="60" w:type="dxa"/>
+              <w:bottom w:w="60" w:type="dxa"/>
+              <w:left w:w="80" w:type="dxa"/>
+              <w:right w:w="80" w:type="dxa"/>
+            </w:tcMar>
+            <w:shd w:fill="F1F5F9"/>
+          </w:tcPr>
+          <w:p>
+            <w:r>
+              <w:rPr>
+                <w:color w:val="374151"/>
+                <w:sz w:val="17"/>
+              </w:rPr>
+              <w:t>Kerapatan Model 3D</w:t>
+            </w:r>
+          </w:p>
+        </w:tc>
+        <w:tc>
+          <w:tcPr>
+            <w:tcW w:type="dxa" w:w="3120"/>
+            <w:tcMar>
+              <w:top w:w="60" w:type="dxa"/>
+              <w:bottom w:w="60" w:type="dxa"/>
+              <w:left w:w="80" w:type="dxa"/>
+              <w:right w:w="80" w:type="dxa"/>
+            </w:tcMar>
+            <w:shd w:fill="F1F5F9"/>
+          </w:tcPr>
+          <w:p>
+            <w:r>
+              <w:rPr>
+                <w:color w:val="374151"/>
+                <w:sz w:val="17"/>
+              </w:rPr>
+              <w:t>Sparse (100 - 400 titik)</w:t>
+            </w:r>
+          </w:p>
+        </w:tc>
+        <w:tc>
+          <w:tcPr>
+            <w:tcW w:type="dxa" w:w="3120"/>
+            <w:tcMar>
+              <w:top w:w="60" w:type="dxa"/>
+              <w:bottom w:w="60" w:type="dxa"/>
+              <w:left w:w="80" w:type="dxa"/>
+              <w:right w:w="80" w:type="dxa"/>
+            </w:tcMar>
+            <w:shd w:fill="F1F5F9"/>
+          </w:tcPr>
+          <w:p>
+            <w:r>
+              <w:rPr>
+                <w:color w:val="374151"/>
+                <w:sz w:val="17"/>
+              </w:rPr>
+              <w:t>Dense (Permukaan Fisik Padat Utuh)</w:t>
+            </w:r>
+          </w:p>
+        </w:tc>
+      </w:tr>
+      <w:tr>
+        <w:tc>
+          <w:tcPr>
+            <w:tcW w:type="dxa" w:w="3120"/>
+            <w:tcMar>
+              <w:top w:w="60" w:type="dxa"/>
+              <w:bottom w:w="60" w:type="dxa"/>
+              <w:left w:w="80" w:type="dxa"/>
+              <w:right w:w="80" w:type="dxa"/>
+            </w:tcMar>
+          </w:tcPr>
+          <w:p>
+            <w:r>
+              <w:rPr>
+                <w:color w:val="374151"/>
+                <w:sz w:val="17"/>
+              </w:rPr>
+              <w:t>Ketahanan Drift</w:t>
+            </w:r>
+          </w:p>
+        </w:tc>
+        <w:tc>
+          <w:tcPr>
+            <w:tcW w:type="dxa" w:w="3120"/>
+            <w:tcMar>
+              <w:top w:w="60" w:type="dxa"/>
+              <w:bottom w:w="60" w:type="dxa"/>
+              <w:left w:w="80" w:type="dxa"/>
+              <w:right w:w="80" w:type="dxa"/>
+            </w:tcMar>
+          </w:tcPr>
+          <w:p>
+            <w:r>
+              <w:rPr>
+                <w:color w:val="374151"/>
+                <w:sz w:val="17"/>
+              </w:rPr>
+              <w:t>Sangat Tinggi (Bundle Adjustment)</w:t>
+            </w:r>
+          </w:p>
+        </w:tc>
+        <w:tc>
+          <w:tcPr>
+            <w:tcW w:type="dxa" w:w="3120"/>
+            <w:tcMar>
+              <w:top w:w="60" w:type="dxa"/>
+              <w:bottom w:w="60" w:type="dxa"/>
+              <w:left w:w="80" w:type="dxa"/>
+              <w:right w:w="80" w:type="dxa"/>
+            </w:tcMar>
+          </w:tcPr>
+          <w:p>
+            <w:r>
+              <w:rPr>
+                <w:color w:val="374151"/>
+                <w:sz w:val="17"/>
+              </w:rPr>
+              <w:t>Sangat Tinggi (Terkunci ORB-SLAM3)</w:t>
+            </w:r>
+          </w:p>
+        </w:tc>
+      </w:tr>
+      <w:tr>
+        <w:tc>
+          <w:tcPr>
+            <w:tcW w:type="dxa" w:w="3120"/>
+            <w:tcMar>
+              <w:top w:w="60" w:type="dxa"/>
+              <w:bottom w:w="60" w:type="dxa"/>
+              <w:left w:w="80" w:type="dxa"/>
+              <w:right w:w="80" w:type="dxa"/>
+            </w:tcMar>
+            <w:shd w:fill="F1F5F9"/>
+          </w:tcPr>
+          <w:p>
+            <w:r>
+              <w:rPr>
+                <w:color w:val="374151"/>
+                <w:sz w:val="17"/>
+              </w:rPr>
+              <w:t>Orientasi Bidang Lantai</w:t>
+            </w:r>
+          </w:p>
+        </w:tc>
+        <w:tc>
+          <w:tcPr>
+            <w:tcW w:type="dxa" w:w="3120"/>
+            <w:tcMar>
+              <w:top w:w="60" w:type="dxa"/>
+              <w:bottom w:w="60" w:type="dxa"/>
+              <w:left w:w="80" w:type="dxa"/>
+              <w:right w:w="80" w:type="dxa"/>
+            </w:tcMar>
+            <w:shd w:fill="F1F5F9"/>
+          </w:tcPr>
+          <w:p>
+            <w:r>
+              <w:rPr>
+                <w:color w:val="374151"/>
+                <w:sz w:val="17"/>
+              </w:rPr>
+              <w:t>Sumbu Bebas Optik</w:t>
+            </w:r>
+          </w:p>
+        </w:tc>
+        <w:tc>
+          <w:tcPr>
+            <w:tcW w:type="dxa" w:w="3120"/>
+            <w:tcMar>
+              <w:top w:w="60" w:type="dxa"/>
+              <w:bottom w:w="60" w:type="dxa"/>
+              <w:left w:w="80" w:type="dxa"/>
+              <w:right w:w="80" w:type="dxa"/>
+            </w:tcMar>
+            <w:shd w:fill="F1F5F9"/>
+          </w:tcPr>
+          <w:p>
+            <w:r>
+              <w:rPr>
+                <w:color w:val="374151"/>
+                <w:sz w:val="17"/>
+              </w:rPr>
+              <w:t>Datar Sempurna di Lantai Grid RViz</w:t>
+            </w:r>
+          </w:p>
+        </w:tc>
+      </w:tr>
+      <w:tr>
+        <w:tc>
+          <w:tcPr>
+            <w:tcW w:type="dxa" w:w="3120"/>
+            <w:tcMar>
+              <w:top w:w="60" w:type="dxa"/>
+              <w:bottom w:w="60" w:type="dxa"/>
+              <w:left w:w="80" w:type="dxa"/>
+              <w:right w:w="80" w:type="dxa"/>
+            </w:tcMar>
+          </w:tcPr>
+          <w:p>
+            <w:r>
+              <w:rPr>
+                <w:color w:val="374151"/>
+                <w:sz w:val="17"/>
+              </w:rPr>
+              <w:t>Format Ekspor Model</w:t>
+            </w:r>
+          </w:p>
+        </w:tc>
+        <w:tc>
+          <w:tcPr>
+            <w:tcW w:type="dxa" w:w="3120"/>
+            <w:tcMar>
+              <w:top w:w="60" w:type="dxa"/>
+              <w:bottom w:w="60" w:type="dxa"/>
+              <w:left w:w="80" w:type="dxa"/>
+              <w:right w:w="80" w:type="dxa"/>
+            </w:tcMar>
+          </w:tcPr>
+          <w:p>
+            <w:r>
+              <w:rPr>
+                <w:color w:val="374151"/>
+                <w:sz w:val="17"/>
+              </w:rPr>
+              <w:t>Trajectory TXT</w:t>
+            </w:r>
+          </w:p>
+        </w:tc>
+        <w:tc>
+          <w:tcPr>
+            <w:tcW w:type="dxa" w:w="3120"/>
+            <w:tcMar>
+              <w:top w:w="60" w:type="dxa"/>
+              <w:bottom w:w="60" w:type="dxa"/>
+              <w:left w:w="80" w:type="dxa"/>
+              <w:right w:w="80" w:type="dxa"/>
+            </w:tcMar>
+          </w:tcPr>
+          <w:p>
+            <w:r>
+              <w:rPr>
+                <w:color w:val="374151"/>
+                <w:sz w:val="17"/>
+              </w:rPr>
+              <w:t>PLY Standard 3D, Three.js Web, PCD</w:t>
+            </w:r>
+          </w:p>
+        </w:tc>
+      </w:tr>
+    </w:tbl>
     <w:p>
       <w:pPr>
         <w:keepNext/>
@@ -2133,7 +2766,7 @@
           <w:color w:val="0096B4"/>
           <w:sz w:val="23"/>
         </w:rPr>
-        <w:t>7.1 Kesimpulan Penelitian &amp; Rekomendasi</w:t>
+        <w:t>11.1 Panduan Pengoperasian Terpadu</w:t>
       </w:r>
     </w:p>
     <w:p>
@@ -2145,7 +2778,7 @@
           <w:color w:val="374151"/>
           <w:sz w:val="20"/>
         </w:rPr>
-        <w:t>1. Fusi multi-sensor Bar30 dan Sonar Ping1D berhasil mengunci skala metrik fisik nyata (meter) dan menghilangkan vertical drift pada sumbu Z.</w:t>
+        <w:t>1. Jalankan run_dense_orbslam_ai.bat untuk meluncurkan fusi lengkap (Pilih [1] Webcam atau [2] Video ROV).</w:t>
       </w:r>
     </w:p>
     <w:p>
@@ -2157,7 +2790,7 @@
           <w:color w:val="374151"/>
           <w:sz w:val="20"/>
         </w:rPr>
-        <w:t>2. Penyelarasan update keyframe dan batas translasi maksimal Odom/MaxTranslation = 0.30 m melenyapkan bug peta melayang secara permanen.</w:t>
+        <w:t>2. Jalankan export_3d_map.bat untuk mengekspor model 3D padat ke file subsea_dense_map.ply.</w:t>
       </w:r>
     </w:p>
     <w:p>
@@ -2169,7 +2802,21 @@
           <w:color w:val="374151"/>
           <w:sz w:val="20"/>
         </w:rPr>
-        <w:t>3. Visualisasi Three.js Web Viewer memberikan kebebasan inspeksi dan pengukuran dimensi tanpa ketergantungan perangkat lunak Linux.</w:t>
+        <w:t>3. Jalankan open_3d_web_viewer.bat untuk menginspeksi hasil rekonstruksi di browser Web Three.js.</w:t>
+      </w:r>
+    </w:p>
+    <w:p>
+      <w:pPr>
+        <w:keepNext/>
+        <w:spacing w:before="280" w:after="80"/>
+      </w:pPr>
+      <w:r>
+        <w:rPr>
+          <w:b/>
+          <w:color w:val="0096B4"/>
+          <w:sz w:val="23"/>
+        </w:rPr>
+        <w:t>11.2 Kesimpulan Akhir</w:t>
       </w:r>
     </w:p>
     <w:p>
@@ -2181,19 +2828,7 @@
           <w:color w:val="374151"/>
           <w:sz w:val="20"/>
         </w:rPr>
-        <w:t>4. Verifikasi ORB-SLAM3 dengan zero-latency bridge membuktikan komputasi SLAM kelas berat dapat berjalan mulus dengan akselerasi GPU Direct3D 12 di Windows 11.</w:t>
-      </w:r>
-    </w:p>
-    <w:p>
-      <w:pPr>
-        <w:spacing w:after="120" w:line="276" w:lineRule="auto"/>
-      </w:pPr>
-      <w:r>
-        <w:rPr>
-          <w:color w:val="374151"/>
-          <w:sz w:val="20"/>
-        </w:rPr>
-        <w:t>5. Arsitektur Dual-Stage (RTAB-Map navigasi live + MASt3R-SLAM post-mission digital twin) memberikan solusi terlengkap bagi robotika bawah air modern.</w:t>
+        <w:t>Proyek ini berhasil menyatukan keunggulan pelacakan geometris klasik tingkat industri (ORB-SLAM3) dengan kecerdasan buatan monokuler (Depth AI MiDaS) dan pemetaan global (RTAB-Map), menghasilkan sistem pemetaan 3D bawah laut modern yang stabil, akurat, dan dapat diinspeksi secara fleksibel.</w:t>
       </w:r>
     </w:p>
     <w:sectPr>

</xml_diff>